<commit_message>
Diagrams follow the system: ER has every column, the two-column keys, the three missing lines and the real minimums; process status, Confirm QT order, stock reason and GET /materials corrected; links between documents fixed
Co-Authored-By: Claude Sonnet 5.5 <noreply@anthropic.com>
</commit_message>
<xml_diff>
--- a/docs/ProjectdocInfo/APIsDiagram/APIs Diagram.docx
+++ b/docs/ProjectdocInfo/APIsDiagram/APIs Diagram.docx
@@ -28,7 +28,7 @@
       <w:r>
         <w:drawing>
           <wp:inline distT="0" distB="0" distL="0" distR="0">
-            <wp:extent cx="4495800" cy="6172200"/>
+            <wp:extent cx="4572000" cy="6172200"/>
             <wp:effectExtent t="0" r="0" b="0" l="0"/>
             <wp:docPr id="1" name="" descr="" title=""/>
             <wp:cNvGraphicFramePr>
@@ -59,7 +59,7 @@
                   <pic:spPr bwMode="auto">
                     <a:xfrm>
                       <a:off x="0" y="0"/>
-                      <a:ext cx="4495800" cy="6172200"/>
+                      <a:ext cx="4572000" cy="6172200"/>
                     </a:xfrm>
                     <a:prstGeom prst="rect">
                       <a:avLst/>
@@ -2839,7 +2839,7 @@
       <w:r>
         <w:drawing>
           <wp:inline distT="0" distB="0" distL="0" distR="0">
-            <wp:extent cx="5114925" cy="6400800"/>
+            <wp:extent cx="5114925" cy="6562725"/>
             <wp:effectExtent t="0" r="0" b="0" l="0"/>
             <wp:docPr id="1" name="" descr="" title=""/>
             <wp:cNvGraphicFramePr>
@@ -2870,7 +2870,7 @@
                   <pic:spPr bwMode="auto">
                     <a:xfrm>
                       <a:off x="0" y="0"/>
-                      <a:ext cx="5114925" cy="6400800"/>
+                      <a:ext cx="5114925" cy="6562725"/>
                     </a:xfrm>
                     <a:prstGeom prst="rect">
                       <a:avLst/>

</xml_diff>

<commit_message>
Documents: no page with only a title or a sentence; User Flow keeps only its diagrams; the end of the Flow Chart main flow joins the production figure
Co-Authored-By: Claude Sonnet 5.5 <noreply@anthropic.com>
</commit_message>
<xml_diff>
--- a/docs/ProjectdocInfo/APIsDiagram/APIs Diagram.docx
+++ b/docs/ProjectdocInfo/APIsDiagram/APIs Diagram.docx
@@ -178,7 +178,7 @@
       <w:r>
         <w:drawing>
           <wp:inline distT="0" distB="0" distL="0" distR="0">
-            <wp:extent cx="8934450" cy="5467350"/>
+            <wp:extent cx="8696325" cy="5324475"/>
             <wp:effectExtent t="0" r="0" b="0" l="0"/>
             <wp:docPr id="1" name="" descr="" title=""/>
             <wp:cNvGraphicFramePr>
@@ -209,7 +209,7 @@
                   <pic:spPr bwMode="auto">
                     <a:xfrm>
                       <a:off x="0" y="0"/>
-                      <a:ext cx="8934450" cy="5467350"/>
+                      <a:ext cx="8696325" cy="5324475"/>
                     </a:xfrm>
                     <a:prstGeom prst="rect">
                       <a:avLst/>

</xml_diff>

<commit_message>
State diagrams drawn with right-angle lines and labels beside them (own renderer, Start and End boxes, a small loop for a change to the same state); the process status keeps its quantity rule in a sentence
Co-Authored-By: Claude Sonnet 5.5 <noreply@anthropic.com>
</commit_message>
<xml_diff>
--- a/docs/ProjectdocInfo/APIsDiagram/APIs Diagram.docx
+++ b/docs/ProjectdocInfo/APIsDiagram/APIs Diagram.docx
@@ -2913,7 +2913,7 @@
       <w:r>
         <w:drawing>
           <wp:inline distT="0" distB="0" distL="0" distR="0">
-            <wp:extent cx="5381625" cy="8001000"/>
+            <wp:extent cx="4267200" cy="8172450"/>
             <wp:effectExtent t="0" r="0" b="0" l="0"/>
             <wp:docPr id="1" name="" descr="" title=""/>
             <wp:cNvGraphicFramePr>
@@ -2944,7 +2944,7 @@
                   <pic:spPr bwMode="auto">
                     <a:xfrm>
                       <a:off x="0" y="0"/>
-                      <a:ext cx="5381625" cy="8001000"/>
+                      <a:ext cx="4267200" cy="8172450"/>
                     </a:xfrm>
                     <a:prstGeom prst="rect">
                       <a:avLst/>

</xml_diff>